<commit_message>
Update 2026 teaching materials
Add and reorganize 2026Teaching materials: add '20 - Module Revision.pptx', rename DVB and SDI slide PDFs to correct numbering, update 'Tutorial 4 - Modulation.docx', add 'Tutorial 5 - Signals 2.docx' and its solutions, remove outdated 'DIG4143Schedule_2026.docx', and add 'session6keyissues.txt'.
</commit_message>
<xml_diff>
--- a/2026Teaching/Tutorial 4 - Modulation.docx
+++ b/2026Teaching/Tutorial 4 - Modulation.docx
@@ -1,6 +1,6 @@
 
 <file path=word/document.xml><?xml version="1.0" encoding="utf-8"?>
-<w:document xmlns:wpc="http://schemas.microsoft.com/office/word/2010/wordprocessingCanvas" xmlns:cx="http://schemas.microsoft.com/office/drawing/2014/chartex" xmlns:cx1="http://schemas.microsoft.com/office/drawing/2015/9/8/chartex" xmlns:cx2="http://schemas.microsoft.com/office/drawing/2015/10/21/chartex" xmlns:cx3="http://schemas.microsoft.com/office/drawing/2016/5/9/chartex" xmlns:cx4="http://schemas.microsoft.com/office/drawing/2016/5/10/chartex" xmlns:cx5="http://schemas.microsoft.com/office/drawing/2016/5/11/chartex" xmlns:cx6="http://schemas.microsoft.com/office/drawing/2016/5/12/chartex" xmlns:cx7="http://schemas.microsoft.com/office/drawing/2016/5/13/chartex" xmlns:cx8="http://schemas.microsoft.com/office/drawing/2016/5/14/chartex" xmlns:mc="http://schemas.openxmlformats.org/markup-compatibility/2006" xmlns:aink="http://schemas.microsoft.com/office/drawing/2016/ink" xmlns:am3d="http://schemas.microsoft.com/office/drawing/2017/model3d" xmlns:o="urn:schemas-microsoft-com:office:office" xmlns:r="http://schemas.openxmlformats.org/officeDocument/2006/relationships" xmlns:m="http://schemas.openxmlformats.org/officeDocument/2006/math" xmlns:v="urn:schemas-microsoft-com:vml" xmlns:wp14="http://schemas.microsoft.com/office/word/2010/wordprocessingDrawing" xmlns:wp="http://schemas.openxmlformats.org/drawingml/2006/wordprocessingDrawing" xmlns:w10="urn:schemas-microsoft-com:office:word" xmlns:w="http://schemas.openxmlformats.org/wordprocessingml/2006/main" xmlns:w14="http://schemas.microsoft.com/office/word/2010/wordml" xmlns:w15="http://schemas.microsoft.com/office/word/2012/wordml" xmlns:w16cid="http://schemas.microsoft.com/office/word/2016/wordml/cid" xmlns:w16se="http://schemas.microsoft.com/office/word/2015/wordml/symex" xmlns:wpg="http://schemas.microsoft.com/office/word/2010/wordprocessingGroup" xmlns:wpi="http://schemas.microsoft.com/office/word/2010/wordprocessingInk" xmlns:wne="http://schemas.microsoft.com/office/word/2006/wordml" xmlns:wps="http://schemas.microsoft.com/office/word/2010/wordprocessingShape" mc:Ignorable="w14 w15 w16se w16cid wp14">
+<w:document xmlns:wpc="http://schemas.microsoft.com/office/word/2010/wordprocessingCanvas" xmlns:cx="http://schemas.microsoft.com/office/drawing/2014/chartex" xmlns:cx1="http://schemas.microsoft.com/office/drawing/2015/9/8/chartex" xmlns:cx2="http://schemas.microsoft.com/office/drawing/2015/10/21/chartex" xmlns:cx3="http://schemas.microsoft.com/office/drawing/2016/5/9/chartex" xmlns:cx4="http://schemas.microsoft.com/office/drawing/2016/5/10/chartex" xmlns:cx5="http://schemas.microsoft.com/office/drawing/2016/5/11/chartex" xmlns:cx6="http://schemas.microsoft.com/office/drawing/2016/5/12/chartex" xmlns:cx7="http://schemas.microsoft.com/office/drawing/2016/5/13/chartex" xmlns:cx8="http://schemas.microsoft.com/office/drawing/2016/5/14/chartex" xmlns:mc="http://schemas.openxmlformats.org/markup-compatibility/2006" xmlns:aink="http://schemas.microsoft.com/office/drawing/2016/ink" xmlns:am3d="http://schemas.microsoft.com/office/drawing/2017/model3d" xmlns:o="urn:schemas-microsoft-com:office:office" xmlns:oel="http://schemas.microsoft.com/office/2019/extlst" xmlns:r="http://schemas.openxmlformats.org/officeDocument/2006/relationships" xmlns:m="http://schemas.openxmlformats.org/officeDocument/2006/math" xmlns:v="urn:schemas-microsoft-com:vml" xmlns:wp14="http://schemas.microsoft.com/office/word/2010/wordprocessingDrawing" xmlns:wp="http://schemas.openxmlformats.org/drawingml/2006/wordprocessingDrawing" xmlns:w10="urn:schemas-microsoft-com:office:word" xmlns:w="http://schemas.openxmlformats.org/wordprocessingml/2006/main" xmlns:w14="http://schemas.microsoft.com/office/word/2010/wordml" xmlns:w15="http://schemas.microsoft.com/office/word/2012/wordml" xmlns:w16cex="http://schemas.microsoft.com/office/word/2018/wordml/cex" xmlns:w16cid="http://schemas.microsoft.com/office/word/2016/wordml/cid" xmlns:w16="http://schemas.microsoft.com/office/word/2018/wordml" xmlns:w16du="http://schemas.microsoft.com/office/word/2023/wordml/word16du" xmlns:w16sdtdh="http://schemas.microsoft.com/office/word/2020/wordml/sdtdatahash" xmlns:w16sdtfl="http://schemas.microsoft.com/office/word/2024/wordml/sdtformatlock" xmlns:w16se="http://schemas.microsoft.com/office/word/2015/wordml/symex" xmlns:wpg="http://schemas.microsoft.com/office/word/2010/wordprocessingGroup" xmlns:wpi="http://schemas.microsoft.com/office/word/2010/wordprocessingInk" xmlns:wne="http://schemas.microsoft.com/office/word/2006/wordml" xmlns:wps="http://schemas.microsoft.com/office/word/2010/wordprocessingShape" mc:Ignorable="w14 w15 w16se w16cid w16 w16cex w16sdtdh w16sdtfl w16du wp14">
   <w:body>
     <w:p>
       <w:pPr>
@@ -24,8 +24,6 @@
         <w:t xml:space="preserve"> Revision – Modulation</w:t>
       </w:r>
     </w:p>
-    <w:p/>
-    <w:p/>
     <w:p>
       <w:r>
         <w:t>Q1</w:t>
@@ -51,12 +49,7 @@
     </w:p>
     <w:p>
       <w:r>
-        <w:t>Expla</w:t>
-      </w:r>
-      <w:bookmarkStart w:id="0" w:name="_GoBack"/>
-      <w:bookmarkEnd w:id="0"/>
-      <w:r>
-        <w:t>in "phase modulation" (educated guess)</w:t>
+        <w:t>Explain "phase modulation" (educated guess)</w:t>
       </w:r>
     </w:p>
     <w:p>
@@ -65,6 +58,108 @@
       </w:r>
     </w:p>
     <w:p/>
+    <w:p/>
+    <w:p>
+      <w:pPr>
+        <w:rPr>
+          <w:lang w:eastAsia="zh-CN"/>
+        </w:rPr>
+      </w:pPr>
+    </w:p>
+    <w:p>
+      <w:pPr>
+        <w:rPr>
+          <w:lang w:eastAsia="zh-CN"/>
+        </w:rPr>
+      </w:pPr>
+    </w:p>
+    <w:p>
+      <w:pPr>
+        <w:rPr>
+          <w:lang w:eastAsia="zh-CN"/>
+        </w:rPr>
+      </w:pPr>
+    </w:p>
+    <w:p>
+      <w:pPr>
+        <w:rPr>
+          <w:lang w:eastAsia="zh-CN"/>
+        </w:rPr>
+      </w:pPr>
+    </w:p>
+    <w:p>
+      <w:pPr>
+        <w:rPr>
+          <w:lang w:eastAsia="zh-CN"/>
+        </w:rPr>
+      </w:pPr>
+    </w:p>
+    <w:p>
+      <w:pPr>
+        <w:rPr>
+          <w:lang w:eastAsia="zh-CN"/>
+        </w:rPr>
+      </w:pPr>
+    </w:p>
+    <w:p>
+      <w:pPr>
+        <w:rPr>
+          <w:lang w:eastAsia="zh-CN"/>
+        </w:rPr>
+      </w:pPr>
+    </w:p>
+    <w:p>
+      <w:pPr>
+        <w:rPr>
+          <w:lang w:eastAsia="zh-CN"/>
+        </w:rPr>
+      </w:pPr>
+    </w:p>
+    <w:p>
+      <w:pPr>
+        <w:rPr>
+          <w:lang w:eastAsia="zh-CN"/>
+        </w:rPr>
+      </w:pPr>
+    </w:p>
+    <w:p>
+      <w:pPr>
+        <w:rPr>
+          <w:lang w:eastAsia="zh-CN"/>
+        </w:rPr>
+      </w:pPr>
+    </w:p>
+    <w:p>
+      <w:pPr>
+        <w:rPr>
+          <w:lang w:eastAsia="zh-CN"/>
+        </w:rPr>
+      </w:pPr>
+    </w:p>
+    <w:p>
+      <w:pPr>
+        <w:rPr>
+          <w:lang w:eastAsia="zh-CN"/>
+        </w:rPr>
+      </w:pPr>
+    </w:p>
+    <w:p>
+      <w:pPr>
+        <w:rPr>
+          <w:lang w:eastAsia="zh-CN"/>
+        </w:rPr>
+      </w:pPr>
+    </w:p>
+    <w:p>
+      <w:pPr>
+        <w:rPr>
+          <w:rFonts w:hint="eastAsia"/>
+          <w:lang w:eastAsia="zh-CN"/>
+        </w:rPr>
+      </w:pPr>
+    </w:p>
+    <w:p/>
+    <w:p/>
     <w:p>
       <w:r>
         <w:t>Q2</w:t>
@@ -81,6 +176,18 @@
       </w:r>
     </w:p>
     <w:p/>
+    <w:p/>
+    <w:p/>
+    <w:p/>
+    <w:p/>
+    <w:p/>
+    <w:p/>
+    <w:p/>
+    <w:p/>
+    <w:p/>
+    <w:p/>
+    <w:p/>
+    <w:p/>
     <w:p>
       <w:r>
         <w:t>Q3</w:t>
@@ -115,6 +222,21 @@
       </w:r>
     </w:p>
     <w:p/>
+    <w:p/>
+    <w:p/>
+    <w:p/>
+    <w:p/>
+    <w:p/>
+    <w:p/>
+    <w:p/>
+    <w:p/>
+    <w:p/>
+    <w:p/>
+    <w:p/>
+    <w:p/>
+    <w:p/>
+    <w:p/>
+    <w:p/>
     <w:p>
       <w:r>
         <w:t>Q</w:t>
@@ -187,6 +309,12 @@
     <w:p/>
     <w:p/>
     <w:sectPr>
+      <w:headerReference w:type="even" r:id="rId6"/>
+      <w:headerReference w:type="default" r:id="rId7"/>
+      <w:footerReference w:type="even" r:id="rId8"/>
+      <w:footerReference w:type="default" r:id="rId9"/>
+      <w:headerReference w:type="first" r:id="rId10"/>
+      <w:footerReference w:type="first" r:id="rId11"/>
       <w:pgSz w:w="11906" w:h="16838"/>
       <w:pgMar w:top="851" w:right="851" w:bottom="851" w:left="851" w:header="709" w:footer="709" w:gutter="0"/>
       <w:cols w:space="708"/>
@@ -196,18 +324,148 @@
 </w:document>
 </file>
 
+<file path=word/endnotes.xml><?xml version="1.0" encoding="utf-8"?>
+<w:endnotes xmlns:wpc="http://schemas.microsoft.com/office/word/2010/wordprocessingCanvas" xmlns:cx="http://schemas.microsoft.com/office/drawing/2014/chartex" xmlns:cx1="http://schemas.microsoft.com/office/drawing/2015/9/8/chartex" xmlns:cx2="http://schemas.microsoft.com/office/drawing/2015/10/21/chartex" xmlns:cx3="http://schemas.microsoft.com/office/drawing/2016/5/9/chartex" xmlns:cx4="http://schemas.microsoft.com/office/drawing/2016/5/10/chartex" xmlns:cx5="http://schemas.microsoft.com/office/drawing/2016/5/11/chartex" xmlns:cx6="http://schemas.microsoft.com/office/drawing/2016/5/12/chartex" xmlns:cx7="http://schemas.microsoft.com/office/drawing/2016/5/13/chartex" xmlns:cx8="http://schemas.microsoft.com/office/drawing/2016/5/14/chartex" xmlns:mc="http://schemas.openxmlformats.org/markup-compatibility/2006" xmlns:aink="http://schemas.microsoft.com/office/drawing/2016/ink" xmlns:am3d="http://schemas.microsoft.com/office/drawing/2017/model3d" xmlns:o="urn:schemas-microsoft-com:office:office" xmlns:oel="http://schemas.microsoft.com/office/2019/extlst" xmlns:r="http://schemas.openxmlformats.org/officeDocument/2006/relationships" xmlns:m="http://schemas.openxmlformats.org/officeDocument/2006/math" xmlns:v="urn:schemas-microsoft-com:vml" xmlns:wp14="http://schemas.microsoft.com/office/word/2010/wordprocessingDrawing" xmlns:wp="http://schemas.openxmlformats.org/drawingml/2006/wordprocessingDrawing" xmlns:w10="urn:schemas-microsoft-com:office:word" xmlns:w="http://schemas.openxmlformats.org/wordprocessingml/2006/main" xmlns:w14="http://schemas.microsoft.com/office/word/2010/wordml" xmlns:w15="http://schemas.microsoft.com/office/word/2012/wordml" xmlns:w16cex="http://schemas.microsoft.com/office/word/2018/wordml/cex" xmlns:w16cid="http://schemas.microsoft.com/office/word/2016/wordml/cid" xmlns:w16="http://schemas.microsoft.com/office/word/2018/wordml" xmlns:w16du="http://schemas.microsoft.com/office/word/2023/wordml/word16du" xmlns:w16sdtdh="http://schemas.microsoft.com/office/word/2020/wordml/sdtdatahash" xmlns:w16sdtfl="http://schemas.microsoft.com/office/word/2024/wordml/sdtformatlock" xmlns:w16se="http://schemas.microsoft.com/office/word/2015/wordml/symex" xmlns:wpg="http://schemas.microsoft.com/office/word/2010/wordprocessingGroup" xmlns:wpi="http://schemas.microsoft.com/office/word/2010/wordprocessingInk" xmlns:wne="http://schemas.microsoft.com/office/word/2006/wordml" xmlns:wps="http://schemas.microsoft.com/office/word/2010/wordprocessingShape" mc:Ignorable="w14 w15 w16se w16cid w16 w16cex w16sdtdh w16sdtfl w16du wp14">
+  <w:endnote w:type="separator" w:id="-1">
+    <w:p>
+      <w:r>
+        <w:separator/>
+      </w:r>
+    </w:p>
+  </w:endnote>
+  <w:endnote w:type="continuationSeparator" w:id="0">
+    <w:p>
+      <w:r>
+        <w:continuationSeparator/>
+      </w:r>
+    </w:p>
+  </w:endnote>
+</w:endnotes>
+</file>
+
+<file path=word/footer1.xml><?xml version="1.0" encoding="utf-8"?>
+<w:ftr xmlns:wpc="http://schemas.microsoft.com/office/word/2010/wordprocessingCanvas" xmlns:cx="http://schemas.microsoft.com/office/drawing/2014/chartex" xmlns:cx1="http://schemas.microsoft.com/office/drawing/2015/9/8/chartex" xmlns:cx2="http://schemas.microsoft.com/office/drawing/2015/10/21/chartex" xmlns:cx3="http://schemas.microsoft.com/office/drawing/2016/5/9/chartex" xmlns:cx4="http://schemas.microsoft.com/office/drawing/2016/5/10/chartex" xmlns:cx5="http://schemas.microsoft.com/office/drawing/2016/5/11/chartex" xmlns:cx6="http://schemas.microsoft.com/office/drawing/2016/5/12/chartex" xmlns:cx7="http://schemas.microsoft.com/office/drawing/2016/5/13/chartex" xmlns:cx8="http://schemas.microsoft.com/office/drawing/2016/5/14/chartex" xmlns:mc="http://schemas.openxmlformats.org/markup-compatibility/2006" xmlns:aink="http://schemas.microsoft.com/office/drawing/2016/ink" xmlns:am3d="http://schemas.microsoft.com/office/drawing/2017/model3d" xmlns:o="urn:schemas-microsoft-com:office:office" xmlns:oel="http://schemas.microsoft.com/office/2019/extlst" xmlns:r="http://schemas.openxmlformats.org/officeDocument/2006/relationships" xmlns:m="http://schemas.openxmlformats.org/officeDocument/2006/math" xmlns:v="urn:schemas-microsoft-com:vml" xmlns:wp14="http://schemas.microsoft.com/office/word/2010/wordprocessingDrawing" xmlns:wp="http://schemas.openxmlformats.org/drawingml/2006/wordprocessingDrawing" xmlns:w10="urn:schemas-microsoft-com:office:word" xmlns:w="http://schemas.openxmlformats.org/wordprocessingml/2006/main" xmlns:w14="http://schemas.microsoft.com/office/word/2010/wordml" xmlns:w15="http://schemas.microsoft.com/office/word/2012/wordml" xmlns:w16cex="http://schemas.microsoft.com/office/word/2018/wordml/cex" xmlns:w16cid="http://schemas.microsoft.com/office/word/2016/wordml/cid" xmlns:w16="http://schemas.microsoft.com/office/word/2018/wordml" xmlns:w16du="http://schemas.microsoft.com/office/word/2023/wordml/word16du" xmlns:w16sdtdh="http://schemas.microsoft.com/office/word/2020/wordml/sdtdatahash" xmlns:w16sdtfl="http://schemas.microsoft.com/office/word/2024/wordml/sdtformatlock" xmlns:w16se="http://schemas.microsoft.com/office/word/2015/wordml/symex" xmlns:wpg="http://schemas.microsoft.com/office/word/2010/wordprocessingGroup" xmlns:wpi="http://schemas.microsoft.com/office/word/2010/wordprocessingInk" xmlns:wne="http://schemas.microsoft.com/office/word/2006/wordml" xmlns:wps="http://schemas.microsoft.com/office/word/2010/wordprocessingShape" mc:Ignorable="w14 w15 w16se w16cid w16 w16cex w16sdtdh w16sdtfl w16du wp14">
+  <w:p>
+    <w:pPr>
+      <w:pStyle w:val="Footer"/>
+    </w:pPr>
+  </w:p>
+</w:ftr>
+</file>
+
+<file path=word/footer2.xml><?xml version="1.0" encoding="utf-8"?>
+<w:ftr xmlns:wpc="http://schemas.microsoft.com/office/word/2010/wordprocessingCanvas" xmlns:cx="http://schemas.microsoft.com/office/drawing/2014/chartex" xmlns:cx1="http://schemas.microsoft.com/office/drawing/2015/9/8/chartex" xmlns:cx2="http://schemas.microsoft.com/office/drawing/2015/10/21/chartex" xmlns:cx3="http://schemas.microsoft.com/office/drawing/2016/5/9/chartex" xmlns:cx4="http://schemas.microsoft.com/office/drawing/2016/5/10/chartex" xmlns:cx5="http://schemas.microsoft.com/office/drawing/2016/5/11/chartex" xmlns:cx6="http://schemas.microsoft.com/office/drawing/2016/5/12/chartex" xmlns:cx7="http://schemas.microsoft.com/office/drawing/2016/5/13/chartex" xmlns:cx8="http://schemas.microsoft.com/office/drawing/2016/5/14/chartex" xmlns:mc="http://schemas.openxmlformats.org/markup-compatibility/2006" xmlns:aink="http://schemas.microsoft.com/office/drawing/2016/ink" xmlns:am3d="http://schemas.microsoft.com/office/drawing/2017/model3d" xmlns:o="urn:schemas-microsoft-com:office:office" xmlns:oel="http://schemas.microsoft.com/office/2019/extlst" xmlns:r="http://schemas.openxmlformats.org/officeDocument/2006/relationships" xmlns:m="http://schemas.openxmlformats.org/officeDocument/2006/math" xmlns:v="urn:schemas-microsoft-com:vml" xmlns:wp14="http://schemas.microsoft.com/office/word/2010/wordprocessingDrawing" xmlns:wp="http://schemas.openxmlformats.org/drawingml/2006/wordprocessingDrawing" xmlns:w10="urn:schemas-microsoft-com:office:word" xmlns:w="http://schemas.openxmlformats.org/wordprocessingml/2006/main" xmlns:w14="http://schemas.microsoft.com/office/word/2010/wordml" xmlns:w15="http://schemas.microsoft.com/office/word/2012/wordml" xmlns:w16cex="http://schemas.microsoft.com/office/word/2018/wordml/cex" xmlns:w16cid="http://schemas.microsoft.com/office/word/2016/wordml/cid" xmlns:w16="http://schemas.microsoft.com/office/word/2018/wordml" xmlns:w16du="http://schemas.microsoft.com/office/word/2023/wordml/word16du" xmlns:w16sdtdh="http://schemas.microsoft.com/office/word/2020/wordml/sdtdatahash" xmlns:w16sdtfl="http://schemas.microsoft.com/office/word/2024/wordml/sdtformatlock" xmlns:w16se="http://schemas.microsoft.com/office/word/2015/wordml/symex" xmlns:wpg="http://schemas.microsoft.com/office/word/2010/wordprocessingGroup" xmlns:wpi="http://schemas.microsoft.com/office/word/2010/wordprocessingInk" xmlns:wne="http://schemas.microsoft.com/office/word/2006/wordml" xmlns:wps="http://schemas.microsoft.com/office/word/2010/wordprocessingShape" mc:Ignorable="w14 w15 w16se w16cid w16 w16cex w16sdtdh w16sdtfl w16du wp14">
+  <w:sdt>
+    <w:sdtPr>
+      <w:id w:val="-1451926347"/>
+      <w:docPartObj>
+        <w:docPartGallery w:val="Page Numbers (Bottom of Page)"/>
+        <w:docPartUnique/>
+      </w:docPartObj>
+    </w:sdtPr>
+    <w:sdtContent>
+      <w:p>
+        <w:pPr>
+          <w:pStyle w:val="Footer"/>
+          <w:jc w:val="right"/>
+        </w:pPr>
+        <w:r>
+          <w:fldChar w:fldCharType="begin"/>
+        </w:r>
+        <w:r>
+          <w:instrText>PAGE   \* MERGEFORMAT</w:instrText>
+        </w:r>
+        <w:r>
+          <w:fldChar w:fldCharType="separate"/>
+        </w:r>
+        <w:r>
+          <w:t>2</w:t>
+        </w:r>
+        <w:r>
+          <w:fldChar w:fldCharType="end"/>
+        </w:r>
+      </w:p>
+    </w:sdtContent>
+  </w:sdt>
+  <w:p>
+    <w:pPr>
+      <w:pStyle w:val="Footer"/>
+    </w:pPr>
+  </w:p>
+</w:ftr>
+</file>
+
+<file path=word/footer3.xml><?xml version="1.0" encoding="utf-8"?>
+<w:ftr xmlns:wpc="http://schemas.microsoft.com/office/word/2010/wordprocessingCanvas" xmlns:cx="http://schemas.microsoft.com/office/drawing/2014/chartex" xmlns:cx1="http://schemas.microsoft.com/office/drawing/2015/9/8/chartex" xmlns:cx2="http://schemas.microsoft.com/office/drawing/2015/10/21/chartex" xmlns:cx3="http://schemas.microsoft.com/office/drawing/2016/5/9/chartex" xmlns:cx4="http://schemas.microsoft.com/office/drawing/2016/5/10/chartex" xmlns:cx5="http://schemas.microsoft.com/office/drawing/2016/5/11/chartex" xmlns:cx6="http://schemas.microsoft.com/office/drawing/2016/5/12/chartex" xmlns:cx7="http://schemas.microsoft.com/office/drawing/2016/5/13/chartex" xmlns:cx8="http://schemas.microsoft.com/office/drawing/2016/5/14/chartex" xmlns:mc="http://schemas.openxmlformats.org/markup-compatibility/2006" xmlns:aink="http://schemas.microsoft.com/office/drawing/2016/ink" xmlns:am3d="http://schemas.microsoft.com/office/drawing/2017/model3d" xmlns:o="urn:schemas-microsoft-com:office:office" xmlns:oel="http://schemas.microsoft.com/office/2019/extlst" xmlns:r="http://schemas.openxmlformats.org/officeDocument/2006/relationships" xmlns:m="http://schemas.openxmlformats.org/officeDocument/2006/math" xmlns:v="urn:schemas-microsoft-com:vml" xmlns:wp14="http://schemas.microsoft.com/office/word/2010/wordprocessingDrawing" xmlns:wp="http://schemas.openxmlformats.org/drawingml/2006/wordprocessingDrawing" xmlns:w10="urn:schemas-microsoft-com:office:word" xmlns:w="http://schemas.openxmlformats.org/wordprocessingml/2006/main" xmlns:w14="http://schemas.microsoft.com/office/word/2010/wordml" xmlns:w15="http://schemas.microsoft.com/office/word/2012/wordml" xmlns:w16cex="http://schemas.microsoft.com/office/word/2018/wordml/cex" xmlns:w16cid="http://schemas.microsoft.com/office/word/2016/wordml/cid" xmlns:w16="http://schemas.microsoft.com/office/word/2018/wordml" xmlns:w16du="http://schemas.microsoft.com/office/word/2023/wordml/word16du" xmlns:w16sdtdh="http://schemas.microsoft.com/office/word/2020/wordml/sdtdatahash" xmlns:w16sdtfl="http://schemas.microsoft.com/office/word/2024/wordml/sdtformatlock" xmlns:w16se="http://schemas.microsoft.com/office/word/2015/wordml/symex" xmlns:wpg="http://schemas.microsoft.com/office/word/2010/wordprocessingGroup" xmlns:wpi="http://schemas.microsoft.com/office/word/2010/wordprocessingInk" xmlns:wne="http://schemas.microsoft.com/office/word/2006/wordml" xmlns:wps="http://schemas.microsoft.com/office/word/2010/wordprocessingShape" mc:Ignorable="w14 w15 w16se w16cid w16 w16cex w16sdtdh w16sdtfl w16du wp14">
+  <w:p>
+    <w:pPr>
+      <w:pStyle w:val="Footer"/>
+    </w:pPr>
+  </w:p>
+</w:ftr>
+</file>
+
+<file path=word/footnotes.xml><?xml version="1.0" encoding="utf-8"?>
+<w:footnotes xmlns:wpc="http://schemas.microsoft.com/office/word/2010/wordprocessingCanvas" xmlns:cx="http://schemas.microsoft.com/office/drawing/2014/chartex" xmlns:cx1="http://schemas.microsoft.com/office/drawing/2015/9/8/chartex" xmlns:cx2="http://schemas.microsoft.com/office/drawing/2015/10/21/chartex" xmlns:cx3="http://schemas.microsoft.com/office/drawing/2016/5/9/chartex" xmlns:cx4="http://schemas.microsoft.com/office/drawing/2016/5/10/chartex" xmlns:cx5="http://schemas.microsoft.com/office/drawing/2016/5/11/chartex" xmlns:cx6="http://schemas.microsoft.com/office/drawing/2016/5/12/chartex" xmlns:cx7="http://schemas.microsoft.com/office/drawing/2016/5/13/chartex" xmlns:cx8="http://schemas.microsoft.com/office/drawing/2016/5/14/chartex" xmlns:mc="http://schemas.openxmlformats.org/markup-compatibility/2006" xmlns:aink="http://schemas.microsoft.com/office/drawing/2016/ink" xmlns:am3d="http://schemas.microsoft.com/office/drawing/2017/model3d" xmlns:o="urn:schemas-microsoft-com:office:office" xmlns:oel="http://schemas.microsoft.com/office/2019/extlst" xmlns:r="http://schemas.openxmlformats.org/officeDocument/2006/relationships" xmlns:m="http://schemas.openxmlformats.org/officeDocument/2006/math" xmlns:v="urn:schemas-microsoft-com:vml" xmlns:wp14="http://schemas.microsoft.com/office/word/2010/wordprocessingDrawing" xmlns:wp="http://schemas.openxmlformats.org/drawingml/2006/wordprocessingDrawing" xmlns:w10="urn:schemas-microsoft-com:office:word" xmlns:w="http://schemas.openxmlformats.org/wordprocessingml/2006/main" xmlns:w14="http://schemas.microsoft.com/office/word/2010/wordml" xmlns:w15="http://schemas.microsoft.com/office/word/2012/wordml" xmlns:w16cex="http://schemas.microsoft.com/office/word/2018/wordml/cex" xmlns:w16cid="http://schemas.microsoft.com/office/word/2016/wordml/cid" xmlns:w16="http://schemas.microsoft.com/office/word/2018/wordml" xmlns:w16du="http://schemas.microsoft.com/office/word/2023/wordml/word16du" xmlns:w16sdtdh="http://schemas.microsoft.com/office/word/2020/wordml/sdtdatahash" xmlns:w16sdtfl="http://schemas.microsoft.com/office/word/2024/wordml/sdtformatlock" xmlns:w16se="http://schemas.microsoft.com/office/word/2015/wordml/symex" xmlns:wpg="http://schemas.microsoft.com/office/word/2010/wordprocessingGroup" xmlns:wpi="http://schemas.microsoft.com/office/word/2010/wordprocessingInk" xmlns:wne="http://schemas.microsoft.com/office/word/2006/wordml" xmlns:wps="http://schemas.microsoft.com/office/word/2010/wordprocessingShape" mc:Ignorable="w14 w15 w16se w16cid w16 w16cex w16sdtdh w16sdtfl w16du wp14">
+  <w:footnote w:type="separator" w:id="-1">
+    <w:p>
+      <w:r>
+        <w:separator/>
+      </w:r>
+    </w:p>
+  </w:footnote>
+  <w:footnote w:type="continuationSeparator" w:id="0">
+    <w:p>
+      <w:r>
+        <w:continuationSeparator/>
+      </w:r>
+    </w:p>
+  </w:footnote>
+</w:footnotes>
+</file>
+
+<file path=word/header1.xml><?xml version="1.0" encoding="utf-8"?>
+<w:hdr xmlns:wpc="http://schemas.microsoft.com/office/word/2010/wordprocessingCanvas" xmlns:cx="http://schemas.microsoft.com/office/drawing/2014/chartex" xmlns:cx1="http://schemas.microsoft.com/office/drawing/2015/9/8/chartex" xmlns:cx2="http://schemas.microsoft.com/office/drawing/2015/10/21/chartex" xmlns:cx3="http://schemas.microsoft.com/office/drawing/2016/5/9/chartex" xmlns:cx4="http://schemas.microsoft.com/office/drawing/2016/5/10/chartex" xmlns:cx5="http://schemas.microsoft.com/office/drawing/2016/5/11/chartex" xmlns:cx6="http://schemas.microsoft.com/office/drawing/2016/5/12/chartex" xmlns:cx7="http://schemas.microsoft.com/office/drawing/2016/5/13/chartex" xmlns:cx8="http://schemas.microsoft.com/office/drawing/2016/5/14/chartex" xmlns:mc="http://schemas.openxmlformats.org/markup-compatibility/2006" xmlns:aink="http://schemas.microsoft.com/office/drawing/2016/ink" xmlns:am3d="http://schemas.microsoft.com/office/drawing/2017/model3d" xmlns:o="urn:schemas-microsoft-com:office:office" xmlns:oel="http://schemas.microsoft.com/office/2019/extlst" xmlns:r="http://schemas.openxmlformats.org/officeDocument/2006/relationships" xmlns:m="http://schemas.openxmlformats.org/officeDocument/2006/math" xmlns:v="urn:schemas-microsoft-com:vml" xmlns:wp14="http://schemas.microsoft.com/office/word/2010/wordprocessingDrawing" xmlns:wp="http://schemas.openxmlformats.org/drawingml/2006/wordprocessingDrawing" xmlns:w10="urn:schemas-microsoft-com:office:word" xmlns:w="http://schemas.openxmlformats.org/wordprocessingml/2006/main" xmlns:w14="http://schemas.microsoft.com/office/word/2010/wordml" xmlns:w15="http://schemas.microsoft.com/office/word/2012/wordml" xmlns:w16cex="http://schemas.microsoft.com/office/word/2018/wordml/cex" xmlns:w16cid="http://schemas.microsoft.com/office/word/2016/wordml/cid" xmlns:w16="http://schemas.microsoft.com/office/word/2018/wordml" xmlns:w16du="http://schemas.microsoft.com/office/word/2023/wordml/word16du" xmlns:w16sdtdh="http://schemas.microsoft.com/office/word/2020/wordml/sdtdatahash" xmlns:w16sdtfl="http://schemas.microsoft.com/office/word/2024/wordml/sdtformatlock" xmlns:w16se="http://schemas.microsoft.com/office/word/2015/wordml/symex" xmlns:wpg="http://schemas.microsoft.com/office/word/2010/wordprocessingGroup" xmlns:wpi="http://schemas.microsoft.com/office/word/2010/wordprocessingInk" xmlns:wne="http://schemas.microsoft.com/office/word/2006/wordml" xmlns:wps="http://schemas.microsoft.com/office/word/2010/wordprocessingShape" mc:Ignorable="w14 w15 w16se w16cid w16 w16cex w16sdtdh w16sdtfl w16du wp14">
+  <w:p>
+    <w:pPr>
+      <w:pStyle w:val="Header"/>
+    </w:pPr>
+  </w:p>
+</w:hdr>
+</file>
+
+<file path=word/header2.xml><?xml version="1.0" encoding="utf-8"?>
+<w:hdr xmlns:wpc="http://schemas.microsoft.com/office/word/2010/wordprocessingCanvas" xmlns:cx="http://schemas.microsoft.com/office/drawing/2014/chartex" xmlns:cx1="http://schemas.microsoft.com/office/drawing/2015/9/8/chartex" xmlns:cx2="http://schemas.microsoft.com/office/drawing/2015/10/21/chartex" xmlns:cx3="http://schemas.microsoft.com/office/drawing/2016/5/9/chartex" xmlns:cx4="http://schemas.microsoft.com/office/drawing/2016/5/10/chartex" xmlns:cx5="http://schemas.microsoft.com/office/drawing/2016/5/11/chartex" xmlns:cx6="http://schemas.microsoft.com/office/drawing/2016/5/12/chartex" xmlns:cx7="http://schemas.microsoft.com/office/drawing/2016/5/13/chartex" xmlns:cx8="http://schemas.microsoft.com/office/drawing/2016/5/14/chartex" xmlns:mc="http://schemas.openxmlformats.org/markup-compatibility/2006" xmlns:aink="http://schemas.microsoft.com/office/drawing/2016/ink" xmlns:am3d="http://schemas.microsoft.com/office/drawing/2017/model3d" xmlns:o="urn:schemas-microsoft-com:office:office" xmlns:oel="http://schemas.microsoft.com/office/2019/extlst" xmlns:r="http://schemas.openxmlformats.org/officeDocument/2006/relationships" xmlns:m="http://schemas.openxmlformats.org/officeDocument/2006/math" xmlns:v="urn:schemas-microsoft-com:vml" xmlns:wp14="http://schemas.microsoft.com/office/word/2010/wordprocessingDrawing" xmlns:wp="http://schemas.openxmlformats.org/drawingml/2006/wordprocessingDrawing" xmlns:w10="urn:schemas-microsoft-com:office:word" xmlns:w="http://schemas.openxmlformats.org/wordprocessingml/2006/main" xmlns:w14="http://schemas.microsoft.com/office/word/2010/wordml" xmlns:w15="http://schemas.microsoft.com/office/word/2012/wordml" xmlns:w16cex="http://schemas.microsoft.com/office/word/2018/wordml/cex" xmlns:w16cid="http://schemas.microsoft.com/office/word/2016/wordml/cid" xmlns:w16="http://schemas.microsoft.com/office/word/2018/wordml" xmlns:w16du="http://schemas.microsoft.com/office/word/2023/wordml/word16du" xmlns:w16sdtdh="http://schemas.microsoft.com/office/word/2020/wordml/sdtdatahash" xmlns:w16sdtfl="http://schemas.microsoft.com/office/word/2024/wordml/sdtformatlock" xmlns:w16se="http://schemas.microsoft.com/office/word/2015/wordml/symex" xmlns:wpg="http://schemas.microsoft.com/office/word/2010/wordprocessingGroup" xmlns:wpi="http://schemas.microsoft.com/office/word/2010/wordprocessingInk" xmlns:wne="http://schemas.microsoft.com/office/word/2006/wordml" xmlns:wps="http://schemas.microsoft.com/office/word/2010/wordprocessingShape" mc:Ignorable="w14 w15 w16se w16cid w16 w16cex w16sdtdh w16sdtfl w16du wp14">
+  <w:p>
+    <w:pPr>
+      <w:pStyle w:val="Header"/>
+    </w:pPr>
+  </w:p>
+</w:hdr>
+</file>
+
+<file path=word/header3.xml><?xml version="1.0" encoding="utf-8"?>
+<w:hdr xmlns:wpc="http://schemas.microsoft.com/office/word/2010/wordprocessingCanvas" xmlns:cx="http://schemas.microsoft.com/office/drawing/2014/chartex" xmlns:cx1="http://schemas.microsoft.com/office/drawing/2015/9/8/chartex" xmlns:cx2="http://schemas.microsoft.com/office/drawing/2015/10/21/chartex" xmlns:cx3="http://schemas.microsoft.com/office/drawing/2016/5/9/chartex" xmlns:cx4="http://schemas.microsoft.com/office/drawing/2016/5/10/chartex" xmlns:cx5="http://schemas.microsoft.com/office/drawing/2016/5/11/chartex" xmlns:cx6="http://schemas.microsoft.com/office/drawing/2016/5/12/chartex" xmlns:cx7="http://schemas.microsoft.com/office/drawing/2016/5/13/chartex" xmlns:cx8="http://schemas.microsoft.com/office/drawing/2016/5/14/chartex" xmlns:mc="http://schemas.openxmlformats.org/markup-compatibility/2006" xmlns:aink="http://schemas.microsoft.com/office/drawing/2016/ink" xmlns:am3d="http://schemas.microsoft.com/office/drawing/2017/model3d" xmlns:o="urn:schemas-microsoft-com:office:office" xmlns:oel="http://schemas.microsoft.com/office/2019/extlst" xmlns:r="http://schemas.openxmlformats.org/officeDocument/2006/relationships" xmlns:m="http://schemas.openxmlformats.org/officeDocument/2006/math" xmlns:v="urn:schemas-microsoft-com:vml" xmlns:wp14="http://schemas.microsoft.com/office/word/2010/wordprocessingDrawing" xmlns:wp="http://schemas.openxmlformats.org/drawingml/2006/wordprocessingDrawing" xmlns:w10="urn:schemas-microsoft-com:office:word" xmlns:w="http://schemas.openxmlformats.org/wordprocessingml/2006/main" xmlns:w14="http://schemas.microsoft.com/office/word/2010/wordml" xmlns:w15="http://schemas.microsoft.com/office/word/2012/wordml" xmlns:w16cex="http://schemas.microsoft.com/office/word/2018/wordml/cex" xmlns:w16cid="http://schemas.microsoft.com/office/word/2016/wordml/cid" xmlns:w16="http://schemas.microsoft.com/office/word/2018/wordml" xmlns:w16du="http://schemas.microsoft.com/office/word/2023/wordml/word16du" xmlns:w16sdtdh="http://schemas.microsoft.com/office/word/2020/wordml/sdtdatahash" xmlns:w16sdtfl="http://schemas.microsoft.com/office/word/2024/wordml/sdtformatlock" xmlns:w16se="http://schemas.microsoft.com/office/word/2015/wordml/symex" xmlns:wpg="http://schemas.microsoft.com/office/word/2010/wordprocessingGroup" xmlns:wpi="http://schemas.microsoft.com/office/word/2010/wordprocessingInk" xmlns:wne="http://schemas.microsoft.com/office/word/2006/wordml" xmlns:wps="http://schemas.microsoft.com/office/word/2010/wordprocessingShape" mc:Ignorable="w14 w15 w16se w16cid w16 w16cex w16sdtdh w16sdtfl w16du wp14">
+  <w:p>
+    <w:pPr>
+      <w:pStyle w:val="Header"/>
+    </w:pPr>
+  </w:p>
+</w:hdr>
+</file>
+
 <file path=word/styles.xml><?xml version="1.0" encoding="utf-8"?>
-<w:styles xmlns:mc="http://schemas.openxmlformats.org/markup-compatibility/2006" xmlns:r="http://schemas.openxmlformats.org/officeDocument/2006/relationships" xmlns:w="http://schemas.openxmlformats.org/wordprocessingml/2006/main" xmlns:w14="http://schemas.microsoft.com/office/word/2010/wordml" xmlns:w15="http://schemas.microsoft.com/office/word/2012/wordml" xmlns:w16cid="http://schemas.microsoft.com/office/word/2016/wordml/cid" xmlns:w16se="http://schemas.microsoft.com/office/word/2015/wordml/symex" mc:Ignorable="w14 w15 w16se w16cid">
+<w:styles xmlns:mc="http://schemas.openxmlformats.org/markup-compatibility/2006" xmlns:r="http://schemas.openxmlformats.org/officeDocument/2006/relationships" xmlns:w="http://schemas.openxmlformats.org/wordprocessingml/2006/main" xmlns:w14="http://schemas.microsoft.com/office/word/2010/wordml" xmlns:w15="http://schemas.microsoft.com/office/word/2012/wordml" xmlns:w16cex="http://schemas.microsoft.com/office/word/2018/wordml/cex" xmlns:w16cid="http://schemas.microsoft.com/office/word/2016/wordml/cid" xmlns:w16="http://schemas.microsoft.com/office/word/2018/wordml" xmlns:w16du="http://schemas.microsoft.com/office/word/2023/wordml/word16du" xmlns:w16sdtdh="http://schemas.microsoft.com/office/word/2020/wordml/sdtdatahash" xmlns:w16sdtfl="http://schemas.microsoft.com/office/word/2024/wordml/sdtformatlock" xmlns:w16se="http://schemas.microsoft.com/office/word/2015/wordml/symex" mc:Ignorable="w14 w15 w16se w16cid w16 w16cex w16sdtdh w16sdtfl w16du">
   <w:docDefaults>
     <w:rPrDefault>
       <w:rPr>
-        <w:rFonts w:ascii="Times New Roman" w:eastAsia="DejaVu Sans Condensed" w:hAnsi="Times New Roman" w:cs="Times New Roman"/>
+        <w:rFonts w:ascii="Times New Roman" w:eastAsiaTheme="minorEastAsia" w:hAnsi="Times New Roman" w:cs="Times New Roman"/>
         <w:lang w:val="en-GB" w:eastAsia="en-US" w:bidi="ar-SA"/>
       </w:rPr>
     </w:rPrDefault>
     <w:pPrDefault/>
   </w:docDefaults>
-  <w:latentStyles w:defLockedState="0" w:defUIPriority="99" w:defSemiHidden="0" w:defUnhideWhenUsed="0" w:defQFormat="0" w:count="375">
+  <w:latentStyles w:defLockedState="0" w:defUIPriority="99" w:defSemiHidden="0" w:defUnhideWhenUsed="0" w:defQFormat="0" w:count="376">
     <w:lsdException w:name="Normal" w:uiPriority="0" w:qFormat="1"/>
     <w:lsdException w:name="heading 1" w:uiPriority="0" w:qFormat="1"/>
     <w:lsdException w:name="heading 2" w:semiHidden="1" w:uiPriority="0" w:unhideWhenUsed="1" w:qFormat="1"/>
@@ -583,6 +841,7 @@
     <w:lsdException w:name="Smart Hyperlink" w:semiHidden="1" w:unhideWhenUsed="1"/>
     <w:lsdException w:name="Hashtag" w:semiHidden="1" w:unhideWhenUsed="1"/>
     <w:lsdException w:name="Unresolved Mention" w:semiHidden="1" w:unhideWhenUsed="1"/>
+    <w:lsdException w:name="Smart Link" w:semiHidden="1" w:unhideWhenUsed="1"/>
   </w:latentStyles>
   <w:style w:type="paragraph" w:default="1" w:styleId="Normal">
     <w:name w:val="Normal"/>
@@ -873,6 +1132,58 @@
       <w:rFonts w:ascii="Times New Roman" w:eastAsia="Times New Roman" w:hAnsi="Times New Roman"/>
       <w:sz w:val="24"/>
       <w:lang w:eastAsia="en-GB"/>
+    </w:rPr>
+  </w:style>
+  <w:style w:type="paragraph" w:styleId="Header">
+    <w:name w:val="header"/>
+    <w:basedOn w:val="Normal"/>
+    <w:link w:val="HeaderChar"/>
+    <w:uiPriority w:val="99"/>
+    <w:unhideWhenUsed/>
+    <w:rsid w:val="009501C2"/>
+    <w:pPr>
+      <w:tabs>
+        <w:tab w:val="center" w:pos="4513"/>
+        <w:tab w:val="right" w:pos="9026"/>
+      </w:tabs>
+    </w:pPr>
+  </w:style>
+  <w:style w:type="character" w:customStyle="1" w:styleId="HeaderChar">
+    <w:name w:val="Header Char"/>
+    <w:basedOn w:val="DefaultParagraphFont"/>
+    <w:link w:val="Header"/>
+    <w:uiPriority w:val="99"/>
+    <w:rsid w:val="009501C2"/>
+    <w:rPr>
+      <w:rFonts w:ascii="Lucida Sans Unicode" w:hAnsi="Lucida Sans Unicode"/>
+      <w:sz w:val="22"/>
+      <w:szCs w:val="24"/>
+    </w:rPr>
+  </w:style>
+  <w:style w:type="paragraph" w:styleId="Footer">
+    <w:name w:val="footer"/>
+    <w:basedOn w:val="Normal"/>
+    <w:link w:val="FooterChar"/>
+    <w:uiPriority w:val="99"/>
+    <w:unhideWhenUsed/>
+    <w:rsid w:val="009501C2"/>
+    <w:pPr>
+      <w:tabs>
+        <w:tab w:val="center" w:pos="4513"/>
+        <w:tab w:val="right" w:pos="9026"/>
+      </w:tabs>
+    </w:pPr>
+  </w:style>
+  <w:style w:type="character" w:customStyle="1" w:styleId="FooterChar">
+    <w:name w:val="Footer Char"/>
+    <w:basedOn w:val="DefaultParagraphFont"/>
+    <w:link w:val="Footer"/>
+    <w:uiPriority w:val="99"/>
+    <w:rsid w:val="009501C2"/>
+    <w:rPr>
+      <w:rFonts w:ascii="Lucida Sans Unicode" w:hAnsi="Lucida Sans Unicode"/>
+      <w:sz w:val="22"/>
+      <w:szCs w:val="24"/>
     </w:rPr>
   </w:style>
 </w:styles>

</xml_diff>